<commit_message>
Ajustes reportes y filtros de caja
</commit_message>
<xml_diff>
--- a/Reportes/Contrato de Fianza 306.docx
+++ b/Reportes/Contrato de Fianza 306.docx
@@ -2,6 +2,68 @@
 <file path=word/document.xml><?xml version="1.0" encoding="utf-8"?>
 <w:document xmlns:wpc="http://schemas.microsoft.com/office/word/2010/wordprocessingCanvas" xmlns:cx="http://schemas.microsoft.com/office/drawing/2014/chartex" xmlns:cx1="http://schemas.microsoft.com/office/drawing/2015/9/8/chartex" xmlns:cx2="http://schemas.microsoft.com/office/drawing/2015/10/21/chartex" xmlns:cx3="http://schemas.microsoft.com/office/drawing/2016/5/9/chartex" xmlns:cx4="http://schemas.microsoft.com/office/drawing/2016/5/10/chartex" xmlns:cx5="http://schemas.microsoft.com/office/drawing/2016/5/11/chartex" xmlns:cx6="http://schemas.microsoft.com/office/drawing/2016/5/12/chartex" xmlns:cx7="http://schemas.microsoft.com/office/drawing/2016/5/13/chartex" xmlns:cx8="http://schemas.microsoft.com/office/drawing/2016/5/14/chartex" xmlns:mc="http://schemas.openxmlformats.org/markup-compatibility/2006" xmlns:aink="http://schemas.microsoft.com/office/drawing/2016/ink" xmlns:am3d="http://schemas.microsoft.com/office/drawing/2017/model3d" xmlns:o="urn:schemas-microsoft-com:office:office" xmlns:oel="http://schemas.microsoft.com/office/2019/extlst" xmlns:r="http://schemas.openxmlformats.org/officeDocument/2006/relationships" xmlns:m="http://schemas.openxmlformats.org/officeDocument/2006/math" xmlns:v="urn:schemas-microsoft-com:vml" xmlns:wp14="http://schemas.microsoft.com/office/word/2010/wordprocessingDrawing" xmlns:wp="http://schemas.openxmlformats.org/drawingml/2006/wordprocessingDrawing" xmlns:w10="urn:schemas-microsoft-com:office:word" xmlns:w="http://schemas.openxmlformats.org/wordprocessingml/2006/main" xmlns:w14="http://schemas.microsoft.com/office/word/2010/wordml" xmlns:w15="http://schemas.microsoft.com/office/word/2012/wordml" xmlns:w16cex="http://schemas.microsoft.com/office/word/2018/wordml/cex" xmlns:w16cid="http://schemas.microsoft.com/office/word/2016/wordml/cid" xmlns:w16="http://schemas.microsoft.com/office/word/2018/wordml" xmlns:w16sdtdh="http://schemas.microsoft.com/office/word/2020/wordml/sdtdatahash" xmlns:w16se="http://schemas.microsoft.com/office/word/2015/wordml/symex" xmlns:wpg="http://schemas.microsoft.com/office/word/2010/wordprocessingGroup" xmlns:wpi="http://schemas.microsoft.com/office/word/2010/wordprocessingInk" xmlns:wne="http://schemas.microsoft.com/office/word/2006/wordml" xmlns:wps="http://schemas.microsoft.com/office/word/2010/wordprocessingShape" mc:Ignorable="w14 w15 w16se w16cid w16 w16cex w16sdtdh wp14">
   <w:body>
+    <w:p>
+      <w:pPr>
+        <w:widowControl w:val="0"/>
+        <w:tabs>
+          <w:tab w:val="left" w:pos="360"/>
+          <w:tab w:val="left" w:pos="720"/>
+          <w:tab w:val="left" w:pos="1080"/>
+          <w:tab w:val="left" w:pos="1440"/>
+          <w:tab w:val="left" w:pos="1800"/>
+          <w:tab w:val="left" w:pos="2160"/>
+          <w:tab w:val="left" w:pos="2520"/>
+          <w:tab w:val="left" w:pos="2880"/>
+          <w:tab w:val="left" w:pos="3240"/>
+          <w:tab w:val="left" w:pos="3600"/>
+          <w:tab w:val="left" w:pos="3960"/>
+          <w:tab w:val="left" w:pos="4320"/>
+          <w:tab w:val="left" w:pos="4680"/>
+          <w:tab w:val="left" w:pos="5040"/>
+          <w:tab w:val="left" w:pos="5400"/>
+          <w:tab w:val="left" w:pos="5760"/>
+          <w:tab w:val="left" w:pos="6120"/>
+          <w:tab w:val="left" w:pos="6480"/>
+          <w:tab w:val="left" w:pos="6840"/>
+          <w:tab w:val="left" w:pos="7200"/>
+          <w:tab w:val="left" w:pos="7560"/>
+          <w:tab w:val="left" w:pos="7920"/>
+          <w:tab w:val="left" w:pos="8280"/>
+          <w:tab w:val="left" w:pos="8640"/>
+          <w:tab w:val="left" w:pos="9000"/>
+          <w:tab w:val="left" w:pos="9360"/>
+          <w:tab w:val="left" w:pos="9720"/>
+          <w:tab w:val="left" w:pos="10080"/>
+          <w:tab w:val="left" w:pos="10440"/>
+          <w:tab w:val="left" w:pos="10800"/>
+        </w:tabs>
+        <w:autoSpaceDE w:val="0"/>
+        <w:autoSpaceDN w:val="0"/>
+        <w:adjustRightInd w:val="0"/>
+        <w:spacing w:after="0" w:line="240" w:lineRule="auto"/>
+        <w:jc w:val="center"/>
+        <w:rPr>
+          <w:rFonts w:ascii="Arial" w:eastAsia="Times New Roman" w:hAnsi="Arial" w:cs="Arial"/>
+          <w:b/>
+          <w:color w:val="000000"/>
+          <w:sz w:val="21"/>
+          <w:szCs w:val="24"/>
+          <w:u w:val="single"/>
+        </w:rPr>
+      </w:pPr>
+      <w:r>
+        <w:rPr>
+          <w:rFonts w:ascii="Arial" w:eastAsia="Times New Roman" w:hAnsi="Arial" w:cs="Arial"/>
+          <w:b/>
+          <w:color w:val="000000"/>
+          <w:sz w:val="21"/>
+          <w:szCs w:val="24"/>
+          <w:u w:val="single"/>
+        </w:rPr>
+        <w:t>FIANZA DE PAGO</w:t>
+      </w:r>
+    </w:p>
+    <w:p/>
     <w:tbl>
       <w:tblPr>
         <w:tblStyle w:val="Tablaconcuadrcula"/>
@@ -112,7 +174,31 @@
                 <w:sz w:val="13"/>
                 <w:szCs w:val="13"/>
               </w:rPr>
-              <w:t>{custom.NumeroFianza}</w:t>
+              <w:t>{</w:t>
+            </w:r>
+            <w:proofErr w:type="spellStart"/>
+            <w:proofErr w:type="gramStart"/>
+            <w:r>
+              <w:rPr>
+                <w:rFonts w:ascii="Arial" w:eastAsia="Times New Roman" w:hAnsi="Arial" w:cs="Arial"/>
+                <w:b/>
+                <w:color w:val="000000"/>
+                <w:sz w:val="13"/>
+                <w:szCs w:val="13"/>
+              </w:rPr>
+              <w:t>custom.NumeroFianza</w:t>
+            </w:r>
+            <w:proofErr w:type="spellEnd"/>
+            <w:proofErr w:type="gramEnd"/>
+            <w:r>
+              <w:rPr>
+                <w:rFonts w:ascii="Arial" w:eastAsia="Times New Roman" w:hAnsi="Arial" w:cs="Arial"/>
+                <w:b/>
+                <w:color w:val="000000"/>
+                <w:sz w:val="13"/>
+                <w:szCs w:val="13"/>
+              </w:rPr>
+              <w:t>}</w:t>
             </w:r>
           </w:p>
         </w:tc>
@@ -206,7 +292,31 @@
                 <w:sz w:val="13"/>
                 <w:szCs w:val="13"/>
               </w:rPr>
-              <w:t>{custom.Tenedor}</w:t>
+              <w:t>{</w:t>
+            </w:r>
+            <w:proofErr w:type="spellStart"/>
+            <w:proofErr w:type="gramStart"/>
+            <w:r>
+              <w:rPr>
+                <w:rFonts w:ascii="Arial" w:eastAsia="Times New Roman" w:hAnsi="Arial" w:cs="Arial"/>
+                <w:b/>
+                <w:color w:val="000000"/>
+                <w:sz w:val="13"/>
+                <w:szCs w:val="13"/>
+              </w:rPr>
+              <w:t>custom.Tenedor</w:t>
+            </w:r>
+            <w:proofErr w:type="spellEnd"/>
+            <w:proofErr w:type="gramEnd"/>
+            <w:r>
+              <w:rPr>
+                <w:rFonts w:ascii="Arial" w:eastAsia="Times New Roman" w:hAnsi="Arial" w:cs="Arial"/>
+                <w:b/>
+                <w:color w:val="000000"/>
+                <w:sz w:val="13"/>
+                <w:szCs w:val="13"/>
+              </w:rPr>
+              <w:t>}</w:t>
             </w:r>
           </w:p>
         </w:tc>
@@ -318,8 +428,10 @@
                 <w:sz w:val="13"/>
                 <w:szCs w:val="13"/>
               </w:rPr>
-              <w:t>{custom.AFavor} / CONTRALORÍA GENERAL DE LA REPÚBLICA</w:t>
+              <w:t>{</w:t>
             </w:r>
+            <w:proofErr w:type="spellStart"/>
+            <w:proofErr w:type="gramStart"/>
             <w:r>
               <w:rPr>
                 <w:rFonts w:ascii="Arial" w:eastAsia="Times New Roman" w:hAnsi="Arial" w:cs="Arial"/>
@@ -328,7 +440,19 @@
                 <w:sz w:val="13"/>
                 <w:szCs w:val="13"/>
               </w:rPr>
-              <w:t xml:space="preserve"> </w:t>
+              <w:t>custom.AFavor</w:t>
+            </w:r>
+            <w:proofErr w:type="spellEnd"/>
+            <w:proofErr w:type="gramEnd"/>
+            <w:r>
+              <w:rPr>
+                <w:rFonts w:ascii="Arial" w:eastAsia="Times New Roman" w:hAnsi="Arial" w:cs="Arial"/>
+                <w:b/>
+                <w:color w:val="000000"/>
+                <w:sz w:val="13"/>
+                <w:szCs w:val="13"/>
+              </w:rPr>
+              <w:t xml:space="preserve">} / CONTRALORÍA GENERAL DE LA REPÚBLICA </w:t>
             </w:r>
           </w:p>
         </w:tc>
@@ -425,7 +549,31 @@
                 <w:sz w:val="13"/>
                 <w:szCs w:val="13"/>
               </w:rPr>
-              <w:t>{custom.Descripcion}</w:t>
+              <w:t>{</w:t>
+            </w:r>
+            <w:proofErr w:type="spellStart"/>
+            <w:proofErr w:type="gramStart"/>
+            <w:r>
+              <w:rPr>
+                <w:rFonts w:ascii="Arial" w:eastAsia="Times New Roman" w:hAnsi="Arial" w:cs="Arial"/>
+                <w:b/>
+                <w:color w:val="000000"/>
+                <w:sz w:val="13"/>
+                <w:szCs w:val="13"/>
+              </w:rPr>
+              <w:t>custom.Descripcion</w:t>
+            </w:r>
+            <w:proofErr w:type="spellEnd"/>
+            <w:proofErr w:type="gramEnd"/>
+            <w:r>
+              <w:rPr>
+                <w:rFonts w:ascii="Arial" w:eastAsia="Times New Roman" w:hAnsi="Arial" w:cs="Arial"/>
+                <w:b/>
+                <w:color w:val="000000"/>
+                <w:sz w:val="13"/>
+                <w:szCs w:val="13"/>
+              </w:rPr>
+              <w:t>}</w:t>
             </w:r>
           </w:p>
         </w:tc>
@@ -517,7 +665,31 @@
                 <w:sz w:val="13"/>
                 <w:szCs w:val="13"/>
               </w:rPr>
-              <w:t>{custom.SumaTextoTotal}</w:t>
+              <w:t>{</w:t>
+            </w:r>
+            <w:proofErr w:type="spellStart"/>
+            <w:proofErr w:type="gramStart"/>
+            <w:r>
+              <w:rPr>
+                <w:rFonts w:ascii="Arial" w:eastAsia="Times New Roman" w:hAnsi="Arial" w:cs="Arial"/>
+                <w:b/>
+                <w:color w:val="000000"/>
+                <w:sz w:val="13"/>
+                <w:szCs w:val="13"/>
+              </w:rPr>
+              <w:t>custom.SumaTextoTotal</w:t>
+            </w:r>
+            <w:proofErr w:type="spellEnd"/>
+            <w:proofErr w:type="gramEnd"/>
+            <w:r>
+              <w:rPr>
+                <w:rFonts w:ascii="Arial" w:eastAsia="Times New Roman" w:hAnsi="Arial" w:cs="Arial"/>
+                <w:b/>
+                <w:color w:val="000000"/>
+                <w:sz w:val="13"/>
+                <w:szCs w:val="13"/>
+              </w:rPr>
+              <w:t>}</w:t>
             </w:r>
           </w:p>
         </w:tc>
@@ -614,7 +786,31 @@
                 <w:sz w:val="13"/>
                 <w:szCs w:val="13"/>
               </w:rPr>
-              <w:t>EL REINTEGRO DE LA SUMA DE {custom.MonedaMonto} QUE CORRESPONDE AL 100% DE LA SUMA ENTREGADA  EN CONCEPTO DE ADELANTO A EL CONTRATISTA DE ACUERDO CON EL CONTRATO PRINCIPAL ARRIBA INDICADO.</w:t>
+              <w:t>EL REINTEGRO DE LA SUMA DE {</w:t>
+            </w:r>
+            <w:proofErr w:type="spellStart"/>
+            <w:proofErr w:type="gramStart"/>
+            <w:r>
+              <w:rPr>
+                <w:rFonts w:ascii="Arial" w:eastAsia="Times New Roman" w:hAnsi="Arial" w:cs="Arial"/>
+                <w:b/>
+                <w:color w:val="000000"/>
+                <w:sz w:val="13"/>
+                <w:szCs w:val="13"/>
+              </w:rPr>
+              <w:t>custom.MonedaMonto</w:t>
+            </w:r>
+            <w:proofErr w:type="spellEnd"/>
+            <w:proofErr w:type="gramEnd"/>
+            <w:r>
+              <w:rPr>
+                <w:rFonts w:ascii="Arial" w:eastAsia="Times New Roman" w:hAnsi="Arial" w:cs="Arial"/>
+                <w:b/>
+                <w:color w:val="000000"/>
+                <w:sz w:val="13"/>
+                <w:szCs w:val="13"/>
+              </w:rPr>
+              <w:t>} QUE CORRESPONDE AL 100% DE LA SUMA ENTREGADA  EN CONCEPTO DE ADELANTO A EL CONTRATISTA DE ACUERDO CON EL CONTRATO PRINCIPAL ARRIBA INDICADO.</w:t>
             </w:r>
           </w:p>
         </w:tc>
@@ -711,105 +907,10 @@
         <w:rPr>
           <w:rFonts w:ascii="Arial" w:eastAsia="Times New Roman" w:hAnsi="Arial" w:cs="Arial"/>
           <w:color w:val="000000"/>
-          <w:sz w:val="15"/>
-          <w:szCs w:val="15"/>
-        </w:rPr>
-      </w:pPr>
-      <w:r>
-        <w:rPr>
-          <w:rFonts w:ascii="Arial" w:eastAsia="Times New Roman" w:hAnsi="Arial" w:cs="Arial"/>
-          <w:b/>
-          <w:color w:val="000000"/>
-          <w:sz w:val="15"/>
-          <w:szCs w:val="15"/>
-        </w:rPr>
-        <w:t>OBJETO:</w:t>
-      </w:r>
-      <w:r>
-        <w:rPr>
-          <w:rFonts w:ascii="Arial" w:eastAsia="Times New Roman" w:hAnsi="Arial" w:cs="Arial"/>
-          <w:color w:val="000000"/>
-          <w:sz w:val="15"/>
-          <w:szCs w:val="15"/>
-        </w:rPr>
-        <w:t xml:space="preserve"> Conste por el presente documento que</w:t>
-      </w:r>
-      <w:r>
-        <w:rPr>
-          <w:rFonts w:ascii="Arial" w:eastAsia="Times New Roman" w:hAnsi="Arial" w:cs="Arial"/>
-          <w:b/>
-          <w:color w:val="000000"/>
-          <w:sz w:val="15"/>
-          <w:szCs w:val="15"/>
-        </w:rPr>
-        <w:t xml:space="preserve"> ASEGURADORA GLOBAL, S.A.,</w:t>
-      </w:r>
-      <w:r>
-        <w:rPr>
-          <w:rFonts w:ascii="Arial" w:eastAsia="Times New Roman" w:hAnsi="Arial" w:cs="Arial"/>
-          <w:color w:val="000000"/>
-          <w:sz w:val="15"/>
-          <w:szCs w:val="15"/>
-        </w:rPr>
-        <w:t xml:space="preserve"> en adelante denominada </w:t>
-      </w:r>
-      <w:r>
-        <w:rPr>
-          <w:rFonts w:ascii="Arial" w:eastAsia="Times New Roman" w:hAnsi="Arial" w:cs="Arial"/>
-          <w:b/>
-          <w:color w:val="000000"/>
-          <w:sz w:val="15"/>
-          <w:szCs w:val="15"/>
-        </w:rPr>
-        <w:t>LA FIADORA</w:t>
-      </w:r>
-      <w:r>
-        <w:rPr>
-          <w:rFonts w:ascii="Arial" w:eastAsia="Times New Roman" w:hAnsi="Arial" w:cs="Arial"/>
-          <w:color w:val="000000"/>
-          <w:sz w:val="15"/>
-          <w:szCs w:val="15"/>
-        </w:rPr>
-        <w:t xml:space="preserve"> por este medio Ie garantiza a </w:t>
-      </w:r>
-      <w:r>
-        <w:rPr>
-          <w:rFonts w:ascii="Arial" w:eastAsia="Times New Roman" w:hAnsi="Arial" w:cs="Arial"/>
-          <w:b/>
-          <w:color w:val="000000"/>
-          <w:sz w:val="15"/>
-          <w:szCs w:val="15"/>
-        </w:rPr>
-        <w:t>LA ENTIDAD ESTATAL BENEFICIARIA</w:t>
-      </w:r>
-      <w:r>
-        <w:rPr>
-          <w:rFonts w:ascii="Arial" w:eastAsia="Times New Roman" w:hAnsi="Arial" w:cs="Arial"/>
-          <w:color w:val="000000"/>
-          <w:sz w:val="15"/>
-          <w:szCs w:val="15"/>
-        </w:rPr>
-        <w:t xml:space="preserve"> el pago a terceros por servicios de mano de obra prestados y suministro de materiales utilizados en la ejecución de </w:t>
-      </w:r>
-      <w:r>
-        <w:rPr>
-          <w:rFonts w:ascii="Arial" w:eastAsia="Times New Roman" w:hAnsi="Arial" w:cs="Arial"/>
-          <w:b/>
-          <w:color w:val="000000"/>
-          <w:sz w:val="15"/>
-          <w:szCs w:val="15"/>
-        </w:rPr>
-        <w:t>EL CONTRATO</w:t>
-      </w:r>
-      <w:r>
-        <w:rPr>
-          <w:rFonts w:ascii="Arial" w:eastAsia="Times New Roman" w:hAnsi="Arial" w:cs="Arial"/>
-          <w:color w:val="000000"/>
-          <w:sz w:val="15"/>
-          <w:szCs w:val="15"/>
-        </w:rPr>
-        <w:t xml:space="preserve"> e incorporados a Ia obra, a la entrega final de la obra o a la conclusión del servicio.</w:t>
-      </w:r>
+          <w:sz w:val="18"/>
+          <w:szCs w:val="18"/>
+        </w:rPr>
+      </w:pPr>
     </w:p>
     <w:p>
       <w:pPr>
@@ -858,6 +959,141 @@
           <w:szCs w:val="15"/>
         </w:rPr>
       </w:pPr>
+      <w:r>
+        <w:rPr>
+          <w:rFonts w:ascii="Arial" w:eastAsia="Times New Roman" w:hAnsi="Arial" w:cs="Arial"/>
+          <w:b/>
+          <w:color w:val="000000"/>
+          <w:sz w:val="15"/>
+          <w:szCs w:val="15"/>
+        </w:rPr>
+        <w:t>OBJETO:</w:t>
+      </w:r>
+      <w:r>
+        <w:rPr>
+          <w:rFonts w:ascii="Arial" w:eastAsia="Times New Roman" w:hAnsi="Arial" w:cs="Arial"/>
+          <w:color w:val="000000"/>
+          <w:sz w:val="15"/>
+          <w:szCs w:val="15"/>
+        </w:rPr>
+        <w:t xml:space="preserve"> Conste por el presente documento que</w:t>
+      </w:r>
+      <w:r>
+        <w:rPr>
+          <w:rFonts w:ascii="Arial" w:eastAsia="Times New Roman" w:hAnsi="Arial" w:cs="Arial"/>
+          <w:b/>
+          <w:color w:val="000000"/>
+          <w:sz w:val="15"/>
+          <w:szCs w:val="15"/>
+        </w:rPr>
+        <w:t xml:space="preserve"> ASEGURADORA GLOBAL, S.A.,</w:t>
+      </w:r>
+      <w:r>
+        <w:rPr>
+          <w:rFonts w:ascii="Arial" w:eastAsia="Times New Roman" w:hAnsi="Arial" w:cs="Arial"/>
+          <w:color w:val="000000"/>
+          <w:sz w:val="15"/>
+          <w:szCs w:val="15"/>
+        </w:rPr>
+        <w:t xml:space="preserve"> en adelante denominada </w:t>
+      </w:r>
+      <w:r>
+        <w:rPr>
+          <w:rFonts w:ascii="Arial" w:eastAsia="Times New Roman" w:hAnsi="Arial" w:cs="Arial"/>
+          <w:b/>
+          <w:color w:val="000000"/>
+          <w:sz w:val="15"/>
+          <w:szCs w:val="15"/>
+        </w:rPr>
+        <w:t>LA FIADORA</w:t>
+      </w:r>
+      <w:r>
+        <w:rPr>
+          <w:rFonts w:ascii="Arial" w:eastAsia="Times New Roman" w:hAnsi="Arial" w:cs="Arial"/>
+          <w:color w:val="000000"/>
+          <w:sz w:val="15"/>
+          <w:szCs w:val="15"/>
+        </w:rPr>
+        <w:t xml:space="preserve"> por este medio </w:t>
+      </w:r>
+      <w:proofErr w:type="spellStart"/>
+      <w:r>
+        <w:rPr>
+          <w:rFonts w:ascii="Arial" w:eastAsia="Times New Roman" w:hAnsi="Arial" w:cs="Arial"/>
+          <w:color w:val="000000"/>
+          <w:sz w:val="15"/>
+          <w:szCs w:val="15"/>
+        </w:rPr>
+        <w:t>Ie</w:t>
+      </w:r>
+      <w:proofErr w:type="spellEnd"/>
+      <w:r>
+        <w:rPr>
+          <w:rFonts w:ascii="Arial" w:eastAsia="Times New Roman" w:hAnsi="Arial" w:cs="Arial"/>
+          <w:color w:val="000000"/>
+          <w:sz w:val="15"/>
+          <w:szCs w:val="15"/>
+        </w:rPr>
+        <w:t xml:space="preserve"> garantiza a </w:t>
+      </w:r>
+      <w:r>
+        <w:rPr>
+          <w:rFonts w:ascii="Arial" w:eastAsia="Times New Roman" w:hAnsi="Arial" w:cs="Arial"/>
+          <w:b/>
+          <w:color w:val="000000"/>
+          <w:sz w:val="15"/>
+          <w:szCs w:val="15"/>
+        </w:rPr>
+        <w:t>LA ENTIDAD ESTATAL BENEFICIARIA</w:t>
+      </w:r>
+      <w:r>
+        <w:rPr>
+          <w:rFonts w:ascii="Arial" w:eastAsia="Times New Roman" w:hAnsi="Arial" w:cs="Arial"/>
+          <w:color w:val="000000"/>
+          <w:sz w:val="15"/>
+          <w:szCs w:val="15"/>
+        </w:rPr>
+        <w:t xml:space="preserve"> el pago a terceros por servicios de mano de obra prestados y suministro de materiales utilizados en la ejecución de </w:t>
+      </w:r>
+      <w:r>
+        <w:rPr>
+          <w:rFonts w:ascii="Arial" w:eastAsia="Times New Roman" w:hAnsi="Arial" w:cs="Arial"/>
+          <w:b/>
+          <w:color w:val="000000"/>
+          <w:sz w:val="15"/>
+          <w:szCs w:val="15"/>
+        </w:rPr>
+        <w:t>EL CONTRATO</w:t>
+      </w:r>
+      <w:r>
+        <w:rPr>
+          <w:rFonts w:ascii="Arial" w:eastAsia="Times New Roman" w:hAnsi="Arial" w:cs="Arial"/>
+          <w:color w:val="000000"/>
+          <w:sz w:val="15"/>
+          <w:szCs w:val="15"/>
+        </w:rPr>
+        <w:t xml:space="preserve"> e incorporados a </w:t>
+      </w:r>
+      <w:proofErr w:type="spellStart"/>
+      <w:r>
+        <w:rPr>
+          <w:rFonts w:ascii="Arial" w:eastAsia="Times New Roman" w:hAnsi="Arial" w:cs="Arial"/>
+          <w:color w:val="000000"/>
+          <w:sz w:val="15"/>
+          <w:szCs w:val="15"/>
+        </w:rPr>
+        <w:t>Ia</w:t>
+      </w:r>
+      <w:proofErr w:type="spellEnd"/>
+      <w:r>
+        <w:rPr>
+          <w:rFonts w:ascii="Arial" w:eastAsia="Times New Roman" w:hAnsi="Arial" w:cs="Arial"/>
+          <w:color w:val="000000"/>
+          <w:sz w:val="15"/>
+          <w:szCs w:val="15"/>
+        </w:rPr>
+        <w:t xml:space="preserve"> obra, a la entrega final de la obra o a la conclusión del servicio.</w:t>
+      </w:r>
     </w:p>
     <w:p>
       <w:pPr>
@@ -906,6 +1142,54 @@
           <w:szCs w:val="15"/>
         </w:rPr>
       </w:pPr>
+    </w:p>
+    <w:p>
+      <w:pPr>
+        <w:widowControl w:val="0"/>
+        <w:tabs>
+          <w:tab w:val="left" w:pos="360"/>
+          <w:tab w:val="left" w:pos="720"/>
+          <w:tab w:val="left" w:pos="1080"/>
+          <w:tab w:val="left" w:pos="1440"/>
+          <w:tab w:val="left" w:pos="1800"/>
+          <w:tab w:val="left" w:pos="2160"/>
+          <w:tab w:val="left" w:pos="2520"/>
+          <w:tab w:val="left" w:pos="2880"/>
+          <w:tab w:val="left" w:pos="3240"/>
+          <w:tab w:val="left" w:pos="3600"/>
+          <w:tab w:val="left" w:pos="3960"/>
+          <w:tab w:val="left" w:pos="4320"/>
+          <w:tab w:val="left" w:pos="4680"/>
+          <w:tab w:val="left" w:pos="5040"/>
+          <w:tab w:val="left" w:pos="5400"/>
+          <w:tab w:val="left" w:pos="5760"/>
+          <w:tab w:val="left" w:pos="6120"/>
+          <w:tab w:val="left" w:pos="6480"/>
+          <w:tab w:val="left" w:pos="6840"/>
+          <w:tab w:val="left" w:pos="7200"/>
+          <w:tab w:val="left" w:pos="7560"/>
+          <w:tab w:val="left" w:pos="7920"/>
+          <w:tab w:val="left" w:pos="8280"/>
+          <w:tab w:val="left" w:pos="8640"/>
+          <w:tab w:val="left" w:pos="9000"/>
+          <w:tab w:val="left" w:pos="9360"/>
+          <w:tab w:val="left" w:pos="9720"/>
+          <w:tab w:val="left" w:pos="10080"/>
+          <w:tab w:val="left" w:pos="10440"/>
+          <w:tab w:val="left" w:pos="10800"/>
+        </w:tabs>
+        <w:autoSpaceDE w:val="0"/>
+        <w:autoSpaceDN w:val="0"/>
+        <w:adjustRightInd w:val="0"/>
+        <w:spacing w:after="0" w:line="240" w:lineRule="auto"/>
+        <w:jc w:val="both"/>
+        <w:rPr>
+          <w:rFonts w:ascii="Arial" w:eastAsia="Times New Roman" w:hAnsi="Arial" w:cs="Arial"/>
+          <w:color w:val="000000"/>
+          <w:sz w:val="15"/>
+          <w:szCs w:val="15"/>
+        </w:rPr>
+      </w:pPr>
       <w:r>
         <w:rPr>
           <w:rFonts w:ascii="Arial" w:eastAsia="Times New Roman" w:hAnsi="Arial" w:cs="Arial"/>
@@ -923,7 +1207,27 @@
           <w:sz w:val="15"/>
           <w:szCs w:val="15"/>
         </w:rPr>
-        <w:t xml:space="preserve"> A la mano de obra se Ie pagará únicamente las sumas que </w:t>
+        <w:t xml:space="preserve"> A la mano de obra se </w:t>
+      </w:r>
+      <w:proofErr w:type="spellStart"/>
+      <w:r>
+        <w:rPr>
+          <w:rFonts w:ascii="Arial" w:eastAsia="Times New Roman" w:hAnsi="Arial" w:cs="Arial"/>
+          <w:color w:val="000000"/>
+          <w:sz w:val="15"/>
+          <w:szCs w:val="15"/>
+        </w:rPr>
+        <w:t>Ie</w:t>
+      </w:r>
+      <w:proofErr w:type="spellEnd"/>
+      <w:r>
+        <w:rPr>
+          <w:rFonts w:ascii="Arial" w:eastAsia="Times New Roman" w:hAnsi="Arial" w:cs="Arial"/>
+          <w:color w:val="000000"/>
+          <w:sz w:val="15"/>
+          <w:szCs w:val="15"/>
+        </w:rPr>
+        <w:t xml:space="preserve"> pagará únicamente las sumas que </w:t>
       </w:r>
       <w:r>
         <w:rPr>
@@ -1080,7 +1384,27 @@
           <w:sz w:val="15"/>
           <w:szCs w:val="15"/>
         </w:rPr>
-        <w:t xml:space="preserve">por eI tiempo trabajado en </w:t>
+        <w:t xml:space="preserve">por </w:t>
+      </w:r>
+      <w:proofErr w:type="spellStart"/>
+      <w:r>
+        <w:rPr>
+          <w:rFonts w:ascii="Arial" w:eastAsia="Times New Roman" w:hAnsi="Arial" w:cs="Arial"/>
+          <w:color w:val="000000"/>
+          <w:sz w:val="15"/>
+          <w:szCs w:val="15"/>
+        </w:rPr>
+        <w:t>eI</w:t>
+      </w:r>
+      <w:proofErr w:type="spellEnd"/>
+      <w:r>
+        <w:rPr>
+          <w:rFonts w:ascii="Arial" w:eastAsia="Times New Roman" w:hAnsi="Arial" w:cs="Arial"/>
+          <w:color w:val="000000"/>
+          <w:sz w:val="15"/>
+          <w:szCs w:val="15"/>
+        </w:rPr>
+        <w:t xml:space="preserve"> tiempo trabajado en </w:t>
       </w:r>
       <w:r>
         <w:rPr>
@@ -1487,7 +1811,27 @@
           <w:sz w:val="15"/>
           <w:szCs w:val="15"/>
         </w:rPr>
-        <w:t xml:space="preserve"> durante el tiempo que la persona trabajó directamente y para la debida ejecución de la misma.</w:t>
+        <w:t xml:space="preserve"> durante el tiempo que la persona trabajó directamente y para la debida ejecución de </w:t>
+      </w:r>
+      <w:proofErr w:type="gramStart"/>
+      <w:r>
+        <w:rPr>
+          <w:rFonts w:ascii="Arial" w:eastAsia="Times New Roman" w:hAnsi="Arial" w:cs="Arial"/>
+          <w:color w:val="000000"/>
+          <w:sz w:val="15"/>
+          <w:szCs w:val="15"/>
+        </w:rPr>
+        <w:t>la misma</w:t>
+      </w:r>
+      <w:proofErr w:type="gramEnd"/>
+      <w:r>
+        <w:rPr>
+          <w:rFonts w:ascii="Arial" w:eastAsia="Times New Roman" w:hAnsi="Arial" w:cs="Arial"/>
+          <w:color w:val="000000"/>
+          <w:sz w:val="15"/>
+          <w:szCs w:val="15"/>
+        </w:rPr>
+        <w:t>.</w:t>
       </w:r>
     </w:p>
     <w:p>
@@ -1600,7 +1944,27 @@
           <w:sz w:val="15"/>
           <w:szCs w:val="15"/>
         </w:rPr>
-        <w:t xml:space="preserve"> A cada proveedor nacional se Ie pagará el valor real del material utilizados en la ejecución de </w:t>
+        <w:t xml:space="preserve"> A cada proveedor nacional se </w:t>
+      </w:r>
+      <w:proofErr w:type="spellStart"/>
+      <w:r>
+        <w:rPr>
+          <w:rFonts w:ascii="Arial" w:eastAsia="Times New Roman" w:hAnsi="Arial" w:cs="Arial"/>
+          <w:color w:val="000000"/>
+          <w:sz w:val="15"/>
+          <w:szCs w:val="15"/>
+        </w:rPr>
+        <w:t>Ie</w:t>
+      </w:r>
+      <w:proofErr w:type="spellEnd"/>
+      <w:r>
+        <w:rPr>
+          <w:rFonts w:ascii="Arial" w:eastAsia="Times New Roman" w:hAnsi="Arial" w:cs="Arial"/>
+          <w:color w:val="000000"/>
+          <w:sz w:val="15"/>
+          <w:szCs w:val="15"/>
+        </w:rPr>
+        <w:t xml:space="preserve"> pagará el valor real del material utilizados en la ejecución de </w:t>
       </w:r>
       <w:r>
         <w:rPr>
@@ -1619,7 +1983,27 @@
           <w:sz w:val="15"/>
           <w:szCs w:val="15"/>
         </w:rPr>
-        <w:t xml:space="preserve"> e incorporados a la obra que se Ie adeude.</w:t>
+        <w:t xml:space="preserve"> e incorporados a la obra que se </w:t>
+      </w:r>
+      <w:proofErr w:type="spellStart"/>
+      <w:r>
+        <w:rPr>
+          <w:rFonts w:ascii="Arial" w:eastAsia="Times New Roman" w:hAnsi="Arial" w:cs="Arial"/>
+          <w:color w:val="000000"/>
+          <w:sz w:val="15"/>
+          <w:szCs w:val="15"/>
+        </w:rPr>
+        <w:t>Ie</w:t>
+      </w:r>
+      <w:proofErr w:type="spellEnd"/>
+      <w:r>
+        <w:rPr>
+          <w:rFonts w:ascii="Arial" w:eastAsia="Times New Roman" w:hAnsi="Arial" w:cs="Arial"/>
+          <w:color w:val="000000"/>
+          <w:sz w:val="15"/>
+          <w:szCs w:val="15"/>
+        </w:rPr>
+        <w:t xml:space="preserve"> adeude.</w:t>
       </w:r>
     </w:p>
     <w:p>
@@ -1732,7 +2116,47 @@
           <w:sz w:val="15"/>
           <w:szCs w:val="15"/>
         </w:rPr>
-        <w:t>Si Ia cuenta presentada por un proveedor fuese superior al valor en plaza de tales materiales, se Ie pagará el valor real del material prevaleciente en la fecha en que se hizo el suministro; si ello no fuere posible establecerlo, se pagará el precio promedio prevaleciente en plaza en la fecha que se hace la reclamación.</w:t>
+        <w:t xml:space="preserve">Si </w:t>
+      </w:r>
+      <w:proofErr w:type="spellStart"/>
+      <w:r>
+        <w:rPr>
+          <w:rFonts w:ascii="Arial" w:eastAsia="Times New Roman" w:hAnsi="Arial" w:cs="Arial"/>
+          <w:color w:val="000000"/>
+          <w:sz w:val="15"/>
+          <w:szCs w:val="15"/>
+        </w:rPr>
+        <w:t>Ia</w:t>
+      </w:r>
+      <w:proofErr w:type="spellEnd"/>
+      <w:r>
+        <w:rPr>
+          <w:rFonts w:ascii="Arial" w:eastAsia="Times New Roman" w:hAnsi="Arial" w:cs="Arial"/>
+          <w:color w:val="000000"/>
+          <w:sz w:val="15"/>
+          <w:szCs w:val="15"/>
+        </w:rPr>
+        <w:t xml:space="preserve"> cuenta presentada por un proveedor fuese superior al valor en plaza de tales materiales, se </w:t>
+      </w:r>
+      <w:proofErr w:type="spellStart"/>
+      <w:r>
+        <w:rPr>
+          <w:rFonts w:ascii="Arial" w:eastAsia="Times New Roman" w:hAnsi="Arial" w:cs="Arial"/>
+          <w:color w:val="000000"/>
+          <w:sz w:val="15"/>
+          <w:szCs w:val="15"/>
+        </w:rPr>
+        <w:t>Ie</w:t>
+      </w:r>
+      <w:proofErr w:type="spellEnd"/>
+      <w:r>
+        <w:rPr>
+          <w:rFonts w:ascii="Arial" w:eastAsia="Times New Roman" w:hAnsi="Arial" w:cs="Arial"/>
+          <w:color w:val="000000"/>
+          <w:sz w:val="15"/>
+          <w:szCs w:val="15"/>
+        </w:rPr>
+        <w:t xml:space="preserve"> pagará el valor real del material prevaleciente en la fecha en que se hizo el suministro; si ello no fuere posible establecerlo, se pagará el precio promedio prevaleciente en plaza en la fecha que se hace la reclamación.</w:t>
       </w:r>
     </w:p>
     <w:p>
@@ -2024,7 +2448,27 @@
           <w:sz w:val="15"/>
           <w:szCs w:val="15"/>
         </w:rPr>
-        <w:t xml:space="preserve"> los presente dentro del plazo establecido en el Articulo 109 de la Ley 56 de 1995. Igual obligación tendrá la compañía de seguros en caso de que optase por pagar el importe de la fianza de cumplimiento, luego de haberse resuelto administrativamente </w:t>
+        <w:t xml:space="preserve"> los presente dentro del plazo establecido en el </w:t>
+      </w:r>
+      <w:proofErr w:type="spellStart"/>
+      <w:r>
+        <w:rPr>
+          <w:rFonts w:ascii="Arial" w:eastAsia="Times New Roman" w:hAnsi="Arial" w:cs="Arial"/>
+          <w:color w:val="000000"/>
+          <w:sz w:val="15"/>
+          <w:szCs w:val="15"/>
+        </w:rPr>
+        <w:t>Articulo</w:t>
+      </w:r>
+      <w:proofErr w:type="spellEnd"/>
+      <w:r>
+        <w:rPr>
+          <w:rFonts w:ascii="Arial" w:eastAsia="Times New Roman" w:hAnsi="Arial" w:cs="Arial"/>
+          <w:color w:val="000000"/>
+          <w:sz w:val="15"/>
+          <w:szCs w:val="15"/>
+        </w:rPr>
+        <w:t xml:space="preserve"> 109 de la Ley 56 de 1995. Igual obligación tendrá la compañía de seguros en caso de que optase por pagar el importe de la fianza de cumplimiento, luego de haberse resuelto administrativamente </w:t>
       </w:r>
       <w:r>
         <w:rPr>
@@ -3009,7 +3453,27 @@
           <w:sz w:val="15"/>
           <w:szCs w:val="15"/>
         </w:rPr>
-        <w:t xml:space="preserve"> haya debido cumplirlas de acuerdo a </w:t>
+        <w:t xml:space="preserve"> haya debido cumplirlas </w:t>
+      </w:r>
+      <w:proofErr w:type="gramStart"/>
+      <w:r>
+        <w:rPr>
+          <w:rFonts w:ascii="Arial" w:eastAsia="Times New Roman" w:hAnsi="Arial" w:cs="Arial"/>
+          <w:color w:val="000000"/>
+          <w:sz w:val="15"/>
+          <w:szCs w:val="15"/>
+        </w:rPr>
+        <w:t>de acuerdo a</w:t>
+      </w:r>
+      <w:proofErr w:type="gramEnd"/>
+      <w:r>
+        <w:rPr>
+          <w:rFonts w:ascii="Arial" w:eastAsia="Times New Roman" w:hAnsi="Arial" w:cs="Arial"/>
+          <w:color w:val="000000"/>
+          <w:sz w:val="15"/>
+          <w:szCs w:val="15"/>
+        </w:rPr>
+        <w:t xml:space="preserve"> </w:t>
       </w:r>
       <w:r>
         <w:rPr>
@@ -3167,7 +3631,27 @@
           <w:sz w:val="15"/>
           <w:szCs w:val="15"/>
         </w:rPr>
-        <w:t xml:space="preserve"> En caso que del texto de la fianza no se desprenda claramente la cantidad que de la misma se destinará al pago de las sumas adeudadas a la mano de obra, por una parte, y a los proveedores, por la otra, </w:t>
+        <w:t xml:space="preserve"> </w:t>
+      </w:r>
+      <w:proofErr w:type="gramStart"/>
+      <w:r>
+        <w:rPr>
+          <w:rFonts w:ascii="Arial" w:eastAsia="Times New Roman" w:hAnsi="Arial" w:cs="Arial"/>
+          <w:color w:val="000000"/>
+          <w:sz w:val="15"/>
+          <w:szCs w:val="15"/>
+        </w:rPr>
+        <w:t>En caso que</w:t>
+      </w:r>
+      <w:proofErr w:type="gramEnd"/>
+      <w:r>
+        <w:rPr>
+          <w:rFonts w:ascii="Arial" w:eastAsia="Times New Roman" w:hAnsi="Arial" w:cs="Arial"/>
+          <w:color w:val="000000"/>
+          <w:sz w:val="15"/>
+          <w:szCs w:val="15"/>
+        </w:rPr>
+        <w:t xml:space="preserve"> del texto de la fianza no se desprenda claramente la cantidad que de la misma se destinará al pago de las sumas adeudadas a la mano de obra, por una parte, y a los proveedores, por la otra, </w:t>
       </w:r>
       <w:r>
         <w:rPr>
@@ -3285,15 +3769,27 @@
           <w:szCs w:val="15"/>
         </w:rPr>
       </w:pPr>
-      <w:r>
-        <w:rPr>
-          <w:rFonts w:ascii="Arial" w:eastAsia="Times New Roman" w:hAnsi="Arial" w:cs="Arial"/>
-          <w:b/>
-          <w:color w:val="000000"/>
-          <w:sz w:val="15"/>
-          <w:szCs w:val="15"/>
-        </w:rPr>
-        <w:t>DISTRIBUClÓN DE PAGOS A PROVEEDORES NACIONALES:</w:t>
+      <w:proofErr w:type="spellStart"/>
+      <w:r>
+        <w:rPr>
+          <w:rFonts w:ascii="Arial" w:eastAsia="Times New Roman" w:hAnsi="Arial" w:cs="Arial"/>
+          <w:b/>
+          <w:color w:val="000000"/>
+          <w:sz w:val="15"/>
+          <w:szCs w:val="15"/>
+        </w:rPr>
+        <w:t>DISTRIBUClÓN</w:t>
+      </w:r>
+      <w:proofErr w:type="spellEnd"/>
+      <w:r>
+        <w:rPr>
+          <w:rFonts w:ascii="Arial" w:eastAsia="Times New Roman" w:hAnsi="Arial" w:cs="Arial"/>
+          <w:b/>
+          <w:color w:val="000000"/>
+          <w:sz w:val="15"/>
+          <w:szCs w:val="15"/>
+        </w:rPr>
+        <w:t xml:space="preserve"> DE PAGOS A PROVEEDORES NACIONALES:</w:t>
       </w:r>
       <w:r>
         <w:rPr>
@@ -3378,7 +3874,27 @@
           <w:sz w:val="15"/>
           <w:szCs w:val="15"/>
         </w:rPr>
-        <w:t xml:space="preserve">, siempre que eI importe de esta fianzas o la suma de ésta destinada al pago de proveedores alcanzare o fuera suficiente para ello. Si los créditos de los proveedores superasen el importe de esta fianza o de la suma de ésta destinada al pago de proveedores, entonces </w:t>
+        <w:t xml:space="preserve">, siempre que </w:t>
+      </w:r>
+      <w:proofErr w:type="spellStart"/>
+      <w:r>
+        <w:rPr>
+          <w:rFonts w:ascii="Arial" w:eastAsia="Times New Roman" w:hAnsi="Arial" w:cs="Arial"/>
+          <w:color w:val="000000"/>
+          <w:sz w:val="15"/>
+          <w:szCs w:val="15"/>
+        </w:rPr>
+        <w:t>eI</w:t>
+      </w:r>
+      <w:proofErr w:type="spellEnd"/>
+      <w:r>
+        <w:rPr>
+          <w:rFonts w:ascii="Arial" w:eastAsia="Times New Roman" w:hAnsi="Arial" w:cs="Arial"/>
+          <w:color w:val="000000"/>
+          <w:sz w:val="15"/>
+          <w:szCs w:val="15"/>
+        </w:rPr>
+        <w:t xml:space="preserve"> importe de esta fianzas o la suma de ésta destinada al pago de proveedores alcanzare o fuera suficiente para ello. Si los créditos de los proveedores superasen el importe de esta fianza o de la suma de ésta destinada al pago de proveedores, entonces </w:t>
       </w:r>
       <w:r>
         <w:rPr>
@@ -3561,15 +4077,27 @@
           <w:szCs w:val="15"/>
         </w:rPr>
       </w:pPr>
-      <w:r>
-        <w:rPr>
-          <w:rFonts w:ascii="Arial" w:eastAsia="Times New Roman" w:hAnsi="Arial" w:cs="Arial"/>
-          <w:b/>
-          <w:color w:val="000000"/>
-          <w:sz w:val="15"/>
-          <w:szCs w:val="15"/>
-        </w:rPr>
-        <w:t>CRÉDlTOS DE SUBCONTRATISTAS:</w:t>
+      <w:proofErr w:type="spellStart"/>
+      <w:r>
+        <w:rPr>
+          <w:rFonts w:ascii="Arial" w:eastAsia="Times New Roman" w:hAnsi="Arial" w:cs="Arial"/>
+          <w:b/>
+          <w:color w:val="000000"/>
+          <w:sz w:val="15"/>
+          <w:szCs w:val="15"/>
+        </w:rPr>
+        <w:t>CRÉDlTOS</w:t>
+      </w:r>
+      <w:proofErr w:type="spellEnd"/>
+      <w:r>
+        <w:rPr>
+          <w:rFonts w:ascii="Arial" w:eastAsia="Times New Roman" w:hAnsi="Arial" w:cs="Arial"/>
+          <w:b/>
+          <w:color w:val="000000"/>
+          <w:sz w:val="15"/>
+          <w:szCs w:val="15"/>
+        </w:rPr>
+        <w:t xml:space="preserve"> DE SUBCONTRATISTAS:</w:t>
       </w:r>
       <w:r>
         <w:rPr>
@@ -3597,7 +4125,17 @@
           <w:sz w:val="15"/>
           <w:szCs w:val="15"/>
         </w:rPr>
-        <w:t xml:space="preserve"> por razón de sub</w:t>
+        <w:t xml:space="preserve"> por razón de </w:t>
+      </w:r>
+      <w:proofErr w:type="spellStart"/>
+      <w:r>
+        <w:rPr>
+          <w:rFonts w:ascii="Arial" w:eastAsia="Times New Roman" w:hAnsi="Arial" w:cs="Arial"/>
+          <w:color w:val="000000"/>
+          <w:sz w:val="15"/>
+          <w:szCs w:val="15"/>
+        </w:rPr>
+        <w:t>sub</w:t>
       </w:r>
       <w:r>
         <w:rPr>
@@ -3607,7 +4145,17 @@
           <w:szCs w:val="15"/>
         </w:rPr>
         <w:noBreakHyphen/>
-        <w:t xml:space="preserve">contratos documentados en forma escrita inherentes a </w:t>
+        <w:t>contratos</w:t>
+      </w:r>
+      <w:proofErr w:type="spellEnd"/>
+      <w:r>
+        <w:rPr>
+          <w:rFonts w:ascii="Arial" w:eastAsia="Times New Roman" w:hAnsi="Arial" w:cs="Arial"/>
+          <w:color w:val="000000"/>
+          <w:sz w:val="15"/>
+          <w:szCs w:val="15"/>
+        </w:rPr>
+        <w:t xml:space="preserve"> documentados en forma escrita inherentes a </w:t>
       </w:r>
       <w:r>
         <w:rPr>
@@ -3626,7 +4174,27 @@
           <w:sz w:val="15"/>
           <w:szCs w:val="15"/>
         </w:rPr>
-        <w:t xml:space="preserve">, a éstos se Ie pagará el importe de los materiales y mano de obra suministrados y no pagados utilizados e incorporados en </w:t>
+        <w:t xml:space="preserve">, a éstos se </w:t>
+      </w:r>
+      <w:proofErr w:type="spellStart"/>
+      <w:r>
+        <w:rPr>
+          <w:rFonts w:ascii="Arial" w:eastAsia="Times New Roman" w:hAnsi="Arial" w:cs="Arial"/>
+          <w:color w:val="000000"/>
+          <w:sz w:val="15"/>
+          <w:szCs w:val="15"/>
+        </w:rPr>
+        <w:t>Ie</w:t>
+      </w:r>
+      <w:proofErr w:type="spellEnd"/>
+      <w:r>
+        <w:rPr>
+          <w:rFonts w:ascii="Arial" w:eastAsia="Times New Roman" w:hAnsi="Arial" w:cs="Arial"/>
+          <w:color w:val="000000"/>
+          <w:sz w:val="15"/>
+          <w:szCs w:val="15"/>
+        </w:rPr>
+        <w:t xml:space="preserve"> pagará el importe de los materiales y mano de obra suministrados y no pagados utilizados e incorporados en </w:t>
       </w:r>
       <w:r>
         <w:rPr>
@@ -3664,7 +4232,17 @@
           <w:sz w:val="15"/>
           <w:szCs w:val="15"/>
         </w:rPr>
-        <w:t>el monto reclamado no podrá exceder el saldo del sub</w:t>
+        <w:t xml:space="preserve">el monto reclamado no podrá exceder el saldo del </w:t>
+      </w:r>
+      <w:proofErr w:type="spellStart"/>
+      <w:r>
+        <w:rPr>
+          <w:rFonts w:ascii="Arial" w:eastAsia="Times New Roman" w:hAnsi="Arial" w:cs="Arial"/>
+          <w:color w:val="000000"/>
+          <w:sz w:val="15"/>
+          <w:szCs w:val="15"/>
+        </w:rPr>
+        <w:t>sub</w:t>
       </w:r>
       <w:r>
         <w:rPr>
@@ -3674,7 +4252,17 @@
           <w:szCs w:val="15"/>
         </w:rPr>
         <w:noBreakHyphen/>
-        <w:t xml:space="preserve">contrato adeudado por </w:t>
+        <w:t>contrato</w:t>
+      </w:r>
+      <w:proofErr w:type="spellEnd"/>
+      <w:r>
+        <w:rPr>
+          <w:rFonts w:ascii="Arial" w:eastAsia="Times New Roman" w:hAnsi="Arial" w:cs="Arial"/>
+          <w:color w:val="000000"/>
+          <w:sz w:val="15"/>
+          <w:szCs w:val="15"/>
+        </w:rPr>
+        <w:t xml:space="preserve"> adeudado por </w:t>
       </w:r>
       <w:r>
         <w:rPr>
@@ -3816,7 +4404,47 @@
           <w:sz w:val="15"/>
           <w:szCs w:val="15"/>
         </w:rPr>
-        <w:t xml:space="preserve"> efectuara los pagos cubiertos por esta fianza siempre y cuando se Ie presenten los contratos, las facturas, comprobantes, órdenes de compra, planillas y demás elementos de juicio que compruebe satisfactoriamente que el material fue suministrado, o eI trabajo fue prestado y que uno o el otro o ambos según sea el caso, fueron utilizados en la ejecución de </w:t>
+        <w:t xml:space="preserve"> efectuara los pagos cubiertos por esta fianza siempre y cuando se </w:t>
+      </w:r>
+      <w:proofErr w:type="spellStart"/>
+      <w:r>
+        <w:rPr>
+          <w:rFonts w:ascii="Arial" w:eastAsia="Times New Roman" w:hAnsi="Arial" w:cs="Arial"/>
+          <w:color w:val="000000"/>
+          <w:sz w:val="15"/>
+          <w:szCs w:val="15"/>
+        </w:rPr>
+        <w:t>Ie</w:t>
+      </w:r>
+      <w:proofErr w:type="spellEnd"/>
+      <w:r>
+        <w:rPr>
+          <w:rFonts w:ascii="Arial" w:eastAsia="Times New Roman" w:hAnsi="Arial" w:cs="Arial"/>
+          <w:color w:val="000000"/>
+          <w:sz w:val="15"/>
+          <w:szCs w:val="15"/>
+        </w:rPr>
+        <w:t xml:space="preserve"> presenten los contratos, las facturas, comprobantes, órdenes de compra, planillas y demás elementos de juicio que compruebe satisfactoriamente que el material fue suministrado, o </w:t>
+      </w:r>
+      <w:proofErr w:type="spellStart"/>
+      <w:r>
+        <w:rPr>
+          <w:rFonts w:ascii="Arial" w:eastAsia="Times New Roman" w:hAnsi="Arial" w:cs="Arial"/>
+          <w:color w:val="000000"/>
+          <w:sz w:val="15"/>
+          <w:szCs w:val="15"/>
+        </w:rPr>
+        <w:t>eI</w:t>
+      </w:r>
+      <w:proofErr w:type="spellEnd"/>
+      <w:r>
+        <w:rPr>
+          <w:rFonts w:ascii="Arial" w:eastAsia="Times New Roman" w:hAnsi="Arial" w:cs="Arial"/>
+          <w:color w:val="000000"/>
+          <w:sz w:val="15"/>
+          <w:szCs w:val="15"/>
+        </w:rPr>
+        <w:t xml:space="preserve"> trabajo fue prestado y que uno o el otro o ambos según sea el caso, fueron utilizados en la ejecución de </w:t>
       </w:r>
       <w:r>
         <w:rPr>
@@ -4120,7 +4748,27 @@
           <w:sz w:val="15"/>
           <w:szCs w:val="15"/>
         </w:rPr>
-        <w:t xml:space="preserve"> conjuntamente con </w:t>
+        <w:t xml:space="preserve"> </w:t>
+      </w:r>
+      <w:proofErr w:type="gramStart"/>
+      <w:r>
+        <w:rPr>
+          <w:rFonts w:ascii="Arial" w:eastAsia="Times New Roman" w:hAnsi="Arial" w:cs="Arial"/>
+          <w:color w:val="000000"/>
+          <w:sz w:val="15"/>
+          <w:szCs w:val="15"/>
+        </w:rPr>
+        <w:t>conjuntamente con</w:t>
+      </w:r>
+      <w:proofErr w:type="gramEnd"/>
+      <w:r>
+        <w:rPr>
+          <w:rFonts w:ascii="Arial" w:eastAsia="Times New Roman" w:hAnsi="Arial" w:cs="Arial"/>
+          <w:color w:val="000000"/>
+          <w:sz w:val="15"/>
+          <w:szCs w:val="15"/>
+        </w:rPr>
+        <w:t xml:space="preserve"> </w:t>
       </w:r>
       <w:r>
         <w:rPr>
@@ -4570,7 +5218,29 @@
           <w:sz w:val="15"/>
           <w:szCs w:val="15"/>
         </w:rPr>
-        <w:t>EN FE DE LO CUAL, se suscribe este Contrato en la ciudad de Panamá, República de Panamá, {custom.FechaActualTextoMin}.</w:t>
+        <w:t>EN FE DE LO CUAL, se suscribe este Contrato en la ciudad de Panamá, República de Panamá, {</w:t>
+      </w:r>
+      <w:proofErr w:type="spellStart"/>
+      <w:proofErr w:type="gramStart"/>
+      <w:r>
+        <w:rPr>
+          <w:rFonts w:ascii="Arial" w:eastAsia="Times New Roman" w:hAnsi="Arial" w:cs="Arial"/>
+          <w:color w:val="000000"/>
+          <w:sz w:val="15"/>
+          <w:szCs w:val="15"/>
+        </w:rPr>
+        <w:t>custom.FechaActualTextoMin</w:t>
+      </w:r>
+      <w:proofErr w:type="spellEnd"/>
+      <w:proofErr w:type="gramEnd"/>
+      <w:r>
+        <w:rPr>
+          <w:rFonts w:ascii="Arial" w:eastAsia="Times New Roman" w:hAnsi="Arial" w:cs="Arial"/>
+          <w:color w:val="000000"/>
+          <w:sz w:val="15"/>
+          <w:szCs w:val="15"/>
+        </w:rPr>
+        <w:t>}.</w:t>
       </w:r>
     </w:p>
     <w:p>
@@ -4798,7 +5468,29 @@
                 <w:sz w:val="16"/>
                 <w:szCs w:val="16"/>
               </w:rPr>
-              <w:t>{custom.Tenedor}</w:t>
+              <w:t>{</w:t>
+            </w:r>
+            <w:proofErr w:type="spellStart"/>
+            <w:proofErr w:type="gramStart"/>
+            <w:r>
+              <w:rPr>
+                <w:b/>
+                <w:bCs/>
+                <w:sz w:val="16"/>
+                <w:szCs w:val="16"/>
+              </w:rPr>
+              <w:t>custom.Tenedor</w:t>
+            </w:r>
+            <w:proofErr w:type="spellEnd"/>
+            <w:proofErr w:type="gramEnd"/>
+            <w:r>
+              <w:rPr>
+                <w:b/>
+                <w:bCs/>
+                <w:sz w:val="16"/>
+                <w:szCs w:val="16"/>
+              </w:rPr>
+              <w:t>}</w:t>
             </w:r>
           </w:p>
         </w:tc>
@@ -5022,23 +5714,295 @@
         <w:autoSpaceDN w:val="0"/>
         <w:adjustRightInd w:val="0"/>
         <w:spacing w:after="0" w:line="240" w:lineRule="auto"/>
-        <w:jc w:val="center"/>
-        <w:rPr>
-          <w:rFonts w:ascii="Arial" w:eastAsia="Times New Roman" w:hAnsi="Arial" w:cs="Arial"/>
-          <w:color w:val="000000"/>
-          <w:sz w:val="11"/>
+        <w:rPr>
+          <w:rFonts w:ascii="Arial" w:eastAsia="Times New Roman" w:hAnsi="Arial" w:cs="Arial"/>
+          <w:color w:val="000000"/>
+          <w:sz w:val="17"/>
           <w:szCs w:val="24"/>
         </w:rPr>
       </w:pPr>
-      <w:r>
-        <w:rPr>
-          <w:rFonts w:ascii="Arial" w:eastAsia="Times New Roman" w:hAnsi="Arial" w:cs="Arial"/>
-          <w:color w:val="000000"/>
-          <w:sz w:val="11"/>
+    </w:p>
+    <w:p>
+      <w:pPr>
+        <w:widowControl w:val="0"/>
+        <w:tabs>
+          <w:tab w:val="left" w:pos="360"/>
+          <w:tab w:val="left" w:pos="720"/>
+          <w:tab w:val="left" w:pos="1080"/>
+          <w:tab w:val="left" w:pos="1440"/>
+          <w:tab w:val="left" w:pos="1800"/>
+          <w:tab w:val="left" w:pos="2160"/>
+          <w:tab w:val="left" w:pos="2520"/>
+          <w:tab w:val="left" w:pos="2880"/>
+          <w:tab w:val="left" w:pos="3240"/>
+          <w:tab w:val="left" w:pos="3600"/>
+          <w:tab w:val="left" w:pos="3960"/>
+          <w:tab w:val="left" w:pos="4320"/>
+          <w:tab w:val="left" w:pos="4680"/>
+          <w:tab w:val="left" w:pos="5040"/>
+          <w:tab w:val="left" w:pos="5400"/>
+          <w:tab w:val="left" w:pos="5760"/>
+          <w:tab w:val="left" w:pos="6120"/>
+          <w:tab w:val="left" w:pos="6480"/>
+          <w:tab w:val="left" w:pos="6840"/>
+          <w:tab w:val="left" w:pos="7200"/>
+          <w:tab w:val="left" w:pos="7560"/>
+          <w:tab w:val="left" w:pos="7920"/>
+          <w:tab w:val="left" w:pos="8280"/>
+          <w:tab w:val="left" w:pos="8640"/>
+          <w:tab w:val="left" w:pos="9000"/>
+          <w:tab w:val="left" w:pos="9360"/>
+          <w:tab w:val="left" w:pos="9720"/>
+          <w:tab w:val="left" w:pos="10080"/>
+          <w:tab w:val="left" w:pos="10440"/>
+          <w:tab w:val="left" w:pos="10800"/>
+        </w:tabs>
+        <w:autoSpaceDE w:val="0"/>
+        <w:autoSpaceDN w:val="0"/>
+        <w:adjustRightInd w:val="0"/>
+        <w:spacing w:after="0" w:line="240" w:lineRule="auto"/>
+        <w:rPr>
+          <w:rFonts w:ascii="Arial" w:eastAsia="Times New Roman" w:hAnsi="Arial" w:cs="Arial"/>
+          <w:color w:val="000000"/>
+          <w:sz w:val="17"/>
           <w:szCs w:val="24"/>
         </w:rPr>
-        <w:t>(Texto aprobado por la Superintendencia de Seguros y Reaseguros de Panamá de acuerdo a Decreto Ejecutivo Nº30</w:t>
-      </w:r>
+      </w:pPr>
+    </w:p>
+    <w:p>
+      <w:pPr>
+        <w:widowControl w:val="0"/>
+        <w:tabs>
+          <w:tab w:val="left" w:pos="360"/>
+          <w:tab w:val="left" w:pos="720"/>
+          <w:tab w:val="left" w:pos="1080"/>
+          <w:tab w:val="left" w:pos="1440"/>
+          <w:tab w:val="left" w:pos="1800"/>
+          <w:tab w:val="left" w:pos="2160"/>
+          <w:tab w:val="left" w:pos="2520"/>
+          <w:tab w:val="left" w:pos="2880"/>
+          <w:tab w:val="left" w:pos="3240"/>
+          <w:tab w:val="left" w:pos="3600"/>
+          <w:tab w:val="left" w:pos="3960"/>
+          <w:tab w:val="left" w:pos="4320"/>
+          <w:tab w:val="left" w:pos="4680"/>
+          <w:tab w:val="left" w:pos="5040"/>
+          <w:tab w:val="left" w:pos="5400"/>
+          <w:tab w:val="left" w:pos="5760"/>
+          <w:tab w:val="left" w:pos="6120"/>
+          <w:tab w:val="left" w:pos="6480"/>
+          <w:tab w:val="left" w:pos="6840"/>
+          <w:tab w:val="left" w:pos="7200"/>
+          <w:tab w:val="left" w:pos="7560"/>
+          <w:tab w:val="left" w:pos="7920"/>
+          <w:tab w:val="left" w:pos="8280"/>
+          <w:tab w:val="left" w:pos="8640"/>
+          <w:tab w:val="left" w:pos="9000"/>
+          <w:tab w:val="left" w:pos="9360"/>
+          <w:tab w:val="left" w:pos="9720"/>
+          <w:tab w:val="left" w:pos="10080"/>
+          <w:tab w:val="left" w:pos="10440"/>
+          <w:tab w:val="left" w:pos="10800"/>
+        </w:tabs>
+        <w:autoSpaceDE w:val="0"/>
+        <w:autoSpaceDN w:val="0"/>
+        <w:adjustRightInd w:val="0"/>
+        <w:spacing w:after="0" w:line="240" w:lineRule="auto"/>
+        <w:rPr>
+          <w:rFonts w:ascii="Arial" w:eastAsia="Times New Roman" w:hAnsi="Arial" w:cs="Arial"/>
+          <w:color w:val="000000"/>
+          <w:sz w:val="17"/>
+          <w:szCs w:val="24"/>
+        </w:rPr>
+      </w:pPr>
+    </w:p>
+    <w:p>
+      <w:pPr>
+        <w:widowControl w:val="0"/>
+        <w:tabs>
+          <w:tab w:val="left" w:pos="360"/>
+          <w:tab w:val="left" w:pos="720"/>
+          <w:tab w:val="left" w:pos="1080"/>
+          <w:tab w:val="left" w:pos="1440"/>
+          <w:tab w:val="left" w:pos="1800"/>
+          <w:tab w:val="left" w:pos="2160"/>
+          <w:tab w:val="left" w:pos="2520"/>
+          <w:tab w:val="left" w:pos="2880"/>
+          <w:tab w:val="left" w:pos="3240"/>
+          <w:tab w:val="left" w:pos="3600"/>
+          <w:tab w:val="left" w:pos="3960"/>
+          <w:tab w:val="left" w:pos="4320"/>
+          <w:tab w:val="left" w:pos="4680"/>
+          <w:tab w:val="left" w:pos="5040"/>
+          <w:tab w:val="left" w:pos="5400"/>
+          <w:tab w:val="left" w:pos="5760"/>
+          <w:tab w:val="left" w:pos="6120"/>
+          <w:tab w:val="left" w:pos="6480"/>
+          <w:tab w:val="left" w:pos="6840"/>
+          <w:tab w:val="left" w:pos="7200"/>
+          <w:tab w:val="left" w:pos="7560"/>
+          <w:tab w:val="left" w:pos="7920"/>
+          <w:tab w:val="left" w:pos="8280"/>
+          <w:tab w:val="left" w:pos="8640"/>
+          <w:tab w:val="left" w:pos="9000"/>
+          <w:tab w:val="left" w:pos="9360"/>
+          <w:tab w:val="left" w:pos="9720"/>
+          <w:tab w:val="left" w:pos="10080"/>
+          <w:tab w:val="left" w:pos="10440"/>
+          <w:tab w:val="left" w:pos="10800"/>
+        </w:tabs>
+        <w:autoSpaceDE w:val="0"/>
+        <w:autoSpaceDN w:val="0"/>
+        <w:adjustRightInd w:val="0"/>
+        <w:spacing w:after="0" w:line="240" w:lineRule="auto"/>
+        <w:rPr>
+          <w:rFonts w:ascii="Arial" w:eastAsia="Times New Roman" w:hAnsi="Arial" w:cs="Arial"/>
+          <w:color w:val="000000"/>
+          <w:sz w:val="17"/>
+          <w:szCs w:val="24"/>
+        </w:rPr>
+      </w:pPr>
+    </w:p>
+    <w:p>
+      <w:pPr>
+        <w:widowControl w:val="0"/>
+        <w:tabs>
+          <w:tab w:val="left" w:pos="360"/>
+          <w:tab w:val="left" w:pos="720"/>
+          <w:tab w:val="left" w:pos="1080"/>
+          <w:tab w:val="left" w:pos="1440"/>
+          <w:tab w:val="left" w:pos="1800"/>
+          <w:tab w:val="left" w:pos="2160"/>
+          <w:tab w:val="left" w:pos="2520"/>
+          <w:tab w:val="left" w:pos="2880"/>
+          <w:tab w:val="left" w:pos="3240"/>
+          <w:tab w:val="left" w:pos="3600"/>
+          <w:tab w:val="left" w:pos="3960"/>
+          <w:tab w:val="left" w:pos="4320"/>
+          <w:tab w:val="left" w:pos="4680"/>
+          <w:tab w:val="left" w:pos="5040"/>
+          <w:tab w:val="left" w:pos="5400"/>
+          <w:tab w:val="left" w:pos="5760"/>
+          <w:tab w:val="left" w:pos="6120"/>
+          <w:tab w:val="left" w:pos="6480"/>
+          <w:tab w:val="left" w:pos="6840"/>
+          <w:tab w:val="left" w:pos="7200"/>
+          <w:tab w:val="left" w:pos="7560"/>
+          <w:tab w:val="left" w:pos="7920"/>
+          <w:tab w:val="left" w:pos="8280"/>
+          <w:tab w:val="left" w:pos="8640"/>
+          <w:tab w:val="left" w:pos="9000"/>
+          <w:tab w:val="left" w:pos="9360"/>
+          <w:tab w:val="left" w:pos="9720"/>
+          <w:tab w:val="left" w:pos="10080"/>
+          <w:tab w:val="left" w:pos="10440"/>
+          <w:tab w:val="left" w:pos="10800"/>
+        </w:tabs>
+        <w:autoSpaceDE w:val="0"/>
+        <w:autoSpaceDN w:val="0"/>
+        <w:adjustRightInd w:val="0"/>
+        <w:spacing w:after="0" w:line="240" w:lineRule="auto"/>
+        <w:rPr>
+          <w:rFonts w:ascii="Arial" w:eastAsia="Times New Roman" w:hAnsi="Arial" w:cs="Arial"/>
+          <w:color w:val="000000"/>
+          <w:sz w:val="17"/>
+          <w:szCs w:val="24"/>
+        </w:rPr>
+      </w:pPr>
+    </w:p>
+    <w:p>
+      <w:pPr>
+        <w:widowControl w:val="0"/>
+        <w:tabs>
+          <w:tab w:val="left" w:pos="360"/>
+          <w:tab w:val="left" w:pos="720"/>
+          <w:tab w:val="left" w:pos="1080"/>
+          <w:tab w:val="left" w:pos="1440"/>
+          <w:tab w:val="left" w:pos="1800"/>
+          <w:tab w:val="left" w:pos="2160"/>
+          <w:tab w:val="left" w:pos="2520"/>
+          <w:tab w:val="left" w:pos="2880"/>
+          <w:tab w:val="left" w:pos="3240"/>
+          <w:tab w:val="left" w:pos="3600"/>
+          <w:tab w:val="left" w:pos="3960"/>
+          <w:tab w:val="left" w:pos="4320"/>
+          <w:tab w:val="left" w:pos="4680"/>
+          <w:tab w:val="left" w:pos="5040"/>
+          <w:tab w:val="left" w:pos="5400"/>
+          <w:tab w:val="left" w:pos="5760"/>
+          <w:tab w:val="left" w:pos="6120"/>
+          <w:tab w:val="left" w:pos="6480"/>
+          <w:tab w:val="left" w:pos="6840"/>
+          <w:tab w:val="left" w:pos="7200"/>
+          <w:tab w:val="left" w:pos="7560"/>
+          <w:tab w:val="left" w:pos="7920"/>
+          <w:tab w:val="left" w:pos="8280"/>
+          <w:tab w:val="left" w:pos="8640"/>
+          <w:tab w:val="left" w:pos="9000"/>
+          <w:tab w:val="left" w:pos="9360"/>
+          <w:tab w:val="left" w:pos="9720"/>
+          <w:tab w:val="left" w:pos="10080"/>
+          <w:tab w:val="left" w:pos="10440"/>
+          <w:tab w:val="left" w:pos="10800"/>
+        </w:tabs>
+        <w:autoSpaceDE w:val="0"/>
+        <w:autoSpaceDN w:val="0"/>
+        <w:adjustRightInd w:val="0"/>
+        <w:spacing w:after="0" w:line="240" w:lineRule="auto"/>
+        <w:rPr>
+          <w:rFonts w:ascii="Arial" w:eastAsia="Times New Roman" w:hAnsi="Arial" w:cs="Arial"/>
+          <w:color w:val="000000"/>
+          <w:sz w:val="17"/>
+          <w:szCs w:val="24"/>
+        </w:rPr>
+      </w:pPr>
+    </w:p>
+    <w:p>
+      <w:pPr>
+        <w:widowControl w:val="0"/>
+        <w:tabs>
+          <w:tab w:val="left" w:pos="360"/>
+          <w:tab w:val="left" w:pos="720"/>
+          <w:tab w:val="left" w:pos="1080"/>
+          <w:tab w:val="left" w:pos="1440"/>
+          <w:tab w:val="left" w:pos="1800"/>
+          <w:tab w:val="left" w:pos="2160"/>
+          <w:tab w:val="left" w:pos="2520"/>
+          <w:tab w:val="left" w:pos="2880"/>
+          <w:tab w:val="left" w:pos="3240"/>
+          <w:tab w:val="left" w:pos="3600"/>
+          <w:tab w:val="left" w:pos="3960"/>
+          <w:tab w:val="left" w:pos="4320"/>
+          <w:tab w:val="left" w:pos="4680"/>
+          <w:tab w:val="left" w:pos="5040"/>
+          <w:tab w:val="left" w:pos="5400"/>
+          <w:tab w:val="left" w:pos="5760"/>
+          <w:tab w:val="left" w:pos="6120"/>
+          <w:tab w:val="left" w:pos="6480"/>
+          <w:tab w:val="left" w:pos="6840"/>
+          <w:tab w:val="left" w:pos="7200"/>
+          <w:tab w:val="left" w:pos="7560"/>
+          <w:tab w:val="left" w:pos="7920"/>
+          <w:tab w:val="left" w:pos="8280"/>
+          <w:tab w:val="left" w:pos="8640"/>
+          <w:tab w:val="left" w:pos="9000"/>
+          <w:tab w:val="left" w:pos="9360"/>
+          <w:tab w:val="left" w:pos="9720"/>
+          <w:tab w:val="left" w:pos="10080"/>
+          <w:tab w:val="left" w:pos="10440"/>
+          <w:tab w:val="left" w:pos="10800"/>
+        </w:tabs>
+        <w:autoSpaceDE w:val="0"/>
+        <w:autoSpaceDN w:val="0"/>
+        <w:adjustRightInd w:val="0"/>
+        <w:spacing w:after="0" w:line="240" w:lineRule="auto"/>
+        <w:rPr>
+          <w:rFonts w:ascii="Arial" w:eastAsia="Times New Roman" w:hAnsi="Arial" w:cs="Arial"/>
+          <w:color w:val="000000"/>
+          <w:sz w:val="17"/>
+          <w:szCs w:val="24"/>
+        </w:rPr>
+      </w:pPr>
     </w:p>
     <w:p>
       <w:pPr>
@@ -5094,7 +6058,27 @@
           <w:sz w:val="11"/>
           <w:szCs w:val="24"/>
         </w:rPr>
-        <w:t>de 3 de Marzo de 2006, emitido por el Ministerio de Comercio e Industrias).</w:t>
+        <w:t xml:space="preserve">(Texto aprobado por la Superintendencia de Seguros y Reaseguros de Panamá </w:t>
+      </w:r>
+      <w:proofErr w:type="gramStart"/>
+      <w:r>
+        <w:rPr>
+          <w:rFonts w:ascii="Arial" w:eastAsia="Times New Roman" w:hAnsi="Arial" w:cs="Arial"/>
+          <w:color w:val="000000"/>
+          <w:sz w:val="11"/>
+          <w:szCs w:val="24"/>
+        </w:rPr>
+        <w:t>de acuerdo a</w:t>
+      </w:r>
+      <w:proofErr w:type="gramEnd"/>
+      <w:r>
+        <w:rPr>
+          <w:rFonts w:ascii="Arial" w:eastAsia="Times New Roman" w:hAnsi="Arial" w:cs="Arial"/>
+          <w:color w:val="000000"/>
+          <w:sz w:val="11"/>
+          <w:szCs w:val="24"/>
+        </w:rPr>
+        <w:t xml:space="preserve"> Decreto Ejecutivo Nº30</w:t>
       </w:r>
     </w:p>
     <w:p>
@@ -5136,6 +6120,83 @@
         <w:autoSpaceDN w:val="0"/>
         <w:adjustRightInd w:val="0"/>
         <w:spacing w:after="0" w:line="240" w:lineRule="auto"/>
+        <w:jc w:val="center"/>
+        <w:rPr>
+          <w:rFonts w:ascii="Arial" w:eastAsia="Times New Roman" w:hAnsi="Arial" w:cs="Arial"/>
+          <w:color w:val="000000"/>
+          <w:sz w:val="11"/>
+          <w:szCs w:val="24"/>
+        </w:rPr>
+      </w:pPr>
+      <w:r>
+        <w:rPr>
+          <w:rFonts w:ascii="Arial" w:eastAsia="Times New Roman" w:hAnsi="Arial" w:cs="Arial"/>
+          <w:color w:val="000000"/>
+          <w:sz w:val="11"/>
+          <w:szCs w:val="24"/>
+        </w:rPr>
+        <w:t xml:space="preserve">de 3 de </w:t>
+      </w:r>
+      <w:proofErr w:type="gramStart"/>
+      <w:r>
+        <w:rPr>
+          <w:rFonts w:ascii="Arial" w:eastAsia="Times New Roman" w:hAnsi="Arial" w:cs="Arial"/>
+          <w:color w:val="000000"/>
+          <w:sz w:val="11"/>
+          <w:szCs w:val="24"/>
+        </w:rPr>
+        <w:t>Marzo</w:t>
+      </w:r>
+      <w:proofErr w:type="gramEnd"/>
+      <w:r>
+        <w:rPr>
+          <w:rFonts w:ascii="Arial" w:eastAsia="Times New Roman" w:hAnsi="Arial" w:cs="Arial"/>
+          <w:color w:val="000000"/>
+          <w:sz w:val="11"/>
+          <w:szCs w:val="24"/>
+        </w:rPr>
+        <w:t xml:space="preserve"> de 2006, emitido por el Ministerio de Comercio e Industrias).</w:t>
+      </w:r>
+    </w:p>
+    <w:p>
+      <w:pPr>
+        <w:widowControl w:val="0"/>
+        <w:tabs>
+          <w:tab w:val="left" w:pos="360"/>
+          <w:tab w:val="left" w:pos="720"/>
+          <w:tab w:val="left" w:pos="1080"/>
+          <w:tab w:val="left" w:pos="1440"/>
+          <w:tab w:val="left" w:pos="1800"/>
+          <w:tab w:val="left" w:pos="2160"/>
+          <w:tab w:val="left" w:pos="2520"/>
+          <w:tab w:val="left" w:pos="2880"/>
+          <w:tab w:val="left" w:pos="3240"/>
+          <w:tab w:val="left" w:pos="3600"/>
+          <w:tab w:val="left" w:pos="3960"/>
+          <w:tab w:val="left" w:pos="4320"/>
+          <w:tab w:val="left" w:pos="4680"/>
+          <w:tab w:val="left" w:pos="5040"/>
+          <w:tab w:val="left" w:pos="5400"/>
+          <w:tab w:val="left" w:pos="5760"/>
+          <w:tab w:val="left" w:pos="6120"/>
+          <w:tab w:val="left" w:pos="6480"/>
+          <w:tab w:val="left" w:pos="6840"/>
+          <w:tab w:val="left" w:pos="7200"/>
+          <w:tab w:val="left" w:pos="7560"/>
+          <w:tab w:val="left" w:pos="7920"/>
+          <w:tab w:val="left" w:pos="8280"/>
+          <w:tab w:val="left" w:pos="8640"/>
+          <w:tab w:val="left" w:pos="9000"/>
+          <w:tab w:val="left" w:pos="9360"/>
+          <w:tab w:val="left" w:pos="9720"/>
+          <w:tab w:val="left" w:pos="10080"/>
+          <w:tab w:val="left" w:pos="10440"/>
+          <w:tab w:val="left" w:pos="10800"/>
+        </w:tabs>
+        <w:autoSpaceDE w:val="0"/>
+        <w:autoSpaceDN w:val="0"/>
+        <w:adjustRightInd w:val="0"/>
+        <w:spacing w:after="0" w:line="240" w:lineRule="auto"/>
         <w:rPr>
           <w:rFonts w:ascii="Arial" w:eastAsia="Times New Roman" w:hAnsi="Arial" w:cs="Arial"/>
           <w:color w:val="000000"/>
@@ -5145,10 +6206,9 @@
       </w:pPr>
     </w:p>
     <w:sectPr>
-      <w:headerReference w:type="default" r:id="rId7"/>
-      <w:footerReference w:type="default" r:id="rId8"/>
+      <w:footerReference w:type="default" r:id="rId7"/>
       <w:pgSz w:w="12240" w:h="15840"/>
-      <w:pgMar w:top="1417" w:right="1080" w:bottom="1417" w:left="1080" w:header="708" w:footer="708" w:gutter="0"/>
+      <w:pgMar w:top="719" w:right="1080" w:bottom="1417" w:left="1080" w:header="708" w:footer="708" w:gutter="0"/>
       <w:cols w:space="708"/>
       <w:docGrid w:linePitch="360"/>
     </w:sectPr>
@@ -5252,72 +6312,6 @@
     </w:p>
   </w:footnote>
 </w:footnotes>
-</file>
-
-<file path=word/header1.xml><?xml version="1.0" encoding="utf-8"?>
-<w:hdr xmlns:wpc="http://schemas.microsoft.com/office/word/2010/wordprocessingCanvas" xmlns:cx="http://schemas.microsoft.com/office/drawing/2014/chartex" xmlns:cx1="http://schemas.microsoft.com/office/drawing/2015/9/8/chartex" xmlns:cx2="http://schemas.microsoft.com/office/drawing/2015/10/21/chartex" xmlns:cx3="http://schemas.microsoft.com/office/drawing/2016/5/9/chartex" xmlns:cx4="http://schemas.microsoft.com/office/drawing/2016/5/10/chartex" xmlns:cx5="http://schemas.microsoft.com/office/drawing/2016/5/11/chartex" xmlns:cx6="http://schemas.microsoft.com/office/drawing/2016/5/12/chartex" xmlns:cx7="http://schemas.microsoft.com/office/drawing/2016/5/13/chartex" xmlns:cx8="http://schemas.microsoft.com/office/drawing/2016/5/14/chartex" xmlns:mc="http://schemas.openxmlformats.org/markup-compatibility/2006" xmlns:aink="http://schemas.microsoft.com/office/drawing/2016/ink" xmlns:am3d="http://schemas.microsoft.com/office/drawing/2017/model3d" xmlns:o="urn:schemas-microsoft-com:office:office" xmlns:oel="http://schemas.microsoft.com/office/2019/extlst" xmlns:r="http://schemas.openxmlformats.org/officeDocument/2006/relationships" xmlns:m="http://schemas.openxmlformats.org/officeDocument/2006/math" xmlns:v="urn:schemas-microsoft-com:vml" xmlns:wp14="http://schemas.microsoft.com/office/word/2010/wordprocessingDrawing" xmlns:wp="http://schemas.openxmlformats.org/drawingml/2006/wordprocessingDrawing" xmlns:w10="urn:schemas-microsoft-com:office:word" xmlns:w="http://schemas.openxmlformats.org/wordprocessingml/2006/main" xmlns:w14="http://schemas.microsoft.com/office/word/2010/wordml" xmlns:w15="http://schemas.microsoft.com/office/word/2012/wordml" xmlns:w16cex="http://schemas.microsoft.com/office/word/2018/wordml/cex" xmlns:w16cid="http://schemas.microsoft.com/office/word/2016/wordml/cid" xmlns:w16="http://schemas.microsoft.com/office/word/2018/wordml" xmlns:w16sdtdh="http://schemas.microsoft.com/office/word/2020/wordml/sdtdatahash" xmlns:w16se="http://schemas.microsoft.com/office/word/2015/wordml/symex" xmlns:wpg="http://schemas.microsoft.com/office/word/2010/wordprocessingGroup" xmlns:wpi="http://schemas.microsoft.com/office/word/2010/wordprocessingInk" xmlns:wne="http://schemas.microsoft.com/office/word/2006/wordml" xmlns:wps="http://schemas.microsoft.com/office/word/2010/wordprocessingShape" mc:Ignorable="w14 w15 w16se w16cid w16 w16cex w16sdtdh wp14">
-  <w:p>
-    <w:pPr>
-      <w:widowControl w:val="0"/>
-      <w:tabs>
-        <w:tab w:val="left" w:pos="360"/>
-        <w:tab w:val="left" w:pos="720"/>
-        <w:tab w:val="left" w:pos="1080"/>
-        <w:tab w:val="left" w:pos="1440"/>
-        <w:tab w:val="left" w:pos="1800"/>
-        <w:tab w:val="left" w:pos="2160"/>
-        <w:tab w:val="left" w:pos="2520"/>
-        <w:tab w:val="left" w:pos="2880"/>
-        <w:tab w:val="left" w:pos="3240"/>
-        <w:tab w:val="left" w:pos="3600"/>
-        <w:tab w:val="left" w:pos="3960"/>
-        <w:tab w:val="left" w:pos="4320"/>
-        <w:tab w:val="left" w:pos="4680"/>
-        <w:tab w:val="left" w:pos="5040"/>
-        <w:tab w:val="left" w:pos="5400"/>
-        <w:tab w:val="left" w:pos="5760"/>
-        <w:tab w:val="left" w:pos="6120"/>
-        <w:tab w:val="left" w:pos="6480"/>
-        <w:tab w:val="left" w:pos="6840"/>
-        <w:tab w:val="left" w:pos="7200"/>
-        <w:tab w:val="left" w:pos="7560"/>
-        <w:tab w:val="left" w:pos="7920"/>
-        <w:tab w:val="left" w:pos="8280"/>
-        <w:tab w:val="left" w:pos="8640"/>
-        <w:tab w:val="left" w:pos="9000"/>
-        <w:tab w:val="left" w:pos="9360"/>
-        <w:tab w:val="left" w:pos="9720"/>
-        <w:tab w:val="left" w:pos="10080"/>
-        <w:tab w:val="left" w:pos="10440"/>
-        <w:tab w:val="left" w:pos="10800"/>
-      </w:tabs>
-      <w:autoSpaceDE w:val="0"/>
-      <w:autoSpaceDN w:val="0"/>
-      <w:adjustRightInd w:val="0"/>
-      <w:spacing w:after="0" w:line="240" w:lineRule="auto"/>
-      <w:jc w:val="center"/>
-      <w:rPr>
-        <w:rFonts w:ascii="Arial" w:eastAsia="Times New Roman" w:hAnsi="Arial" w:cs="Arial"/>
-        <w:b/>
-        <w:color w:val="000000"/>
-        <w:sz w:val="21"/>
-        <w:szCs w:val="24"/>
-        <w:u w:val="single"/>
-      </w:rPr>
-    </w:pPr>
-    <w:r>
-      <w:rPr>
-        <w:rFonts w:ascii="Arial" w:eastAsia="Times New Roman" w:hAnsi="Arial" w:cs="Arial"/>
-        <w:b/>
-        <w:color w:val="000000"/>
-        <w:sz w:val="21"/>
-        <w:szCs w:val="24"/>
-        <w:u w:val="single"/>
-      </w:rPr>
-      <w:t>FIANZA DE PAGO</w:t>
-    </w:r>
-  </w:p>
-</w:hdr>
 </file>
 
 <file path=word/numbering.xml><?xml version="1.0" encoding="utf-8"?>

</xml_diff>